<commit_message>
Meetings 5-8: adopt the Essential Learning Map as the single EMS form
- Add the Essential Learning Map (one form built across Meetings 5–8) and make it
  each meeting's EMS form; Solution Tree tools are the per-step 'think with'.
- Retire the three separate capture templates (Essential Standards Organizer,
  Learning Target Breakdown, Proficiency Anchors) from the Meeting 5–8 resource
  lists and the resources page (files remain in public/templates).
- Update the Meetings 5–8 roadmap one-pager to the single-Map model and link a new
  'modeled examples by subject & grade' handout.
- Add the Essential Learning Map — Modeled Examples handout (completed Map per
  core subject/grade plus CTE, VAPA, PE).

Co-Authored-By: Claude Opus 4.8 <noreply@anthropic.com>
</commit_message>
<xml_diff>
--- a/public/handouts/ems-meetings-5-8-roadmap.docx
+++ b/public/handouts/ems-meetings-5-8-roadmap.docx
@@ -94,7 +94,7 @@
           <w:sz w:val="22"/>
           <w:szCs w:val="22"/>
         </w:rPr>
-        <w:t xml:space="preserve">PLC Question 1 — What do we want students to learn? One journey in four steps.</w:t>
+        <w:t xml:space="preserve">PLC Question 1 — What do we want students to learn? One journey, one form, four steps.</w:t>
       </w:r>
     </w:p>
     <w:p>
@@ -125,7 +125,7 @@
           <w:sz w:val="22"/>
           <w:szCs w:val="22"/>
         </w:rPr>
-        <w:t xml:space="preserve">These four meetings are one journey, not four separate tasks. You start from your course's standards and narrow to a shared, concrete picture of what students must learn and what proficiency looks like — so the common assessment you design next is built on one definition, not five.</w:t>
+        <w:t xml:space="preserve">These four meetings are one journey, not four separate tasks. You start from your course's standards and narrow to a shared, concrete picture of what students must learn and what proficiency looks like — so the common assessment you design next is built on one definition, not five. One form, the Essential Learning Map, travels with your team across all four meetings and holds the whole record.</w:t>
       </w:r>
     </w:p>
     <w:tbl>
@@ -220,7 +220,7 @@
                 <w:sz w:val="20"/>
                 <w:szCs w:val="20"/>
               </w:rPr>
-              <w:t xml:space="preserve">What you leave with</w:t>
+              <w:t xml:space="preserve">Recorded on the Map</w:t>
             </w:r>
           </w:p>
         </w:tc>
@@ -326,7 +326,7 @@
                 <w:sz w:val="21"/>
                 <w:szCs w:val="21"/>
               </w:rPr>
-              <w:t xml:space="preserve">One selected essential standard.</w:t>
+              <w:t xml:space="preserve">Step 1 · Essential standard</w:t>
             </w:r>
           </w:p>
         </w:tc>
@@ -432,7 +432,7 @@
                 <w:sz w:val="21"/>
                 <w:szCs w:val="21"/>
               </w:rPr>
-              <w:t xml:space="preserve">Draft learning targets.</w:t>
+              <w:t xml:space="preserve">Step 2 · Learning targets</w:t>
             </w:r>
           </w:p>
         </w:tc>
@@ -538,7 +538,7 @@
                 <w:sz w:val="21"/>
                 <w:szCs w:val="21"/>
               </w:rPr>
-              <w:t xml:space="preserve">Success criteria for each target.</w:t>
+              <w:t xml:space="preserve">Step 3 · Success criteria</w:t>
             </w:r>
           </w:p>
         </w:tc>
@@ -644,7 +644,7 @@
                 <w:sz w:val="21"/>
                 <w:szCs w:val="21"/>
               </w:rPr>
-              <w:t xml:space="preserve">An agreed picture of proficiency.</w:t>
+              <w:t xml:space="preserve">Step 4 · Proficiency anchors</w:t>
             </w:r>
           </w:p>
         </w:tc>
@@ -662,7 +662,7 @@
           <w:sz w:val="21"/>
           <w:szCs w:val="21"/>
         </w:rPr>
-        <w:t xml:space="preserve">How the pieces stack: the standard is the promise → the learning targets are the steps → the success criteria are how you'll know a student arrived. Meeting 8 locks in that shared picture before any assessment is written.</w:t>
+        <w:t xml:space="preserve">How the pieces stack: the standard is the promise → the learning targets are the steps → the success criteria are how you'll know a student arrived. A completed Essential Learning Map is your team's end product for this cycle.</w:t>
       </w:r>
     </w:p>
     <w:p>
@@ -679,7 +679,7 @@
           <w:sz w:val="25"/>
           <w:szCs w:val="25"/>
         </w:rPr>
-        <w:t xml:space="preserve">One tool to think with, one sheet to capture</w:t>
+        <w:t xml:space="preserve">One form, one tool per step</w:t>
       </w:r>
     </w:p>
     <w:p>
@@ -693,7 +693,7 @@
           <w:sz w:val="22"/>
           <w:szCs w:val="22"/>
         </w:rPr>
-        <w:t xml:space="preserve">Each meeting pairs a method tool (how to think) with a capture sheet (where you write it down). You don't need more than that.</w:t>
+        <w:t xml:space="preserve">Your team carries a single form — the Essential Learning Map — and completes one step each meeting. Use the Solution Tree tool linked in each step to do the thinking; record the result on the Map.</w:t>
       </w:r>
     </w:p>
     <w:tbl>
@@ -710,8 +710,8 @@
       </w:tblPr>
       <w:tblGrid>
         <w:gridCol w:w="1123"/>
-        <w:gridCol w:w="4493"/>
-        <w:gridCol w:w="3744"/>
+        <w:gridCol w:w="4680"/>
+        <w:gridCol w:w="3557"/>
       </w:tblGrid>
       <w:tr>
         <w:trPr>
@@ -744,7 +744,7 @@
         </w:tc>
         <w:tc>
           <w:tcPr>
-            <w:tcW w:type="dxa" w:w="4493"/>
+            <w:tcW w:type="dxa" w:w="4680"/>
             <w:shd w:fill="9B2C2C" w:color="auto" w:val="clear"/>
             <w:tcMar>
               <w:top w:type="dxa" w:w="90"/>
@@ -769,7 +769,7 @@
         </w:tc>
         <w:tc>
           <w:tcPr>
-            <w:tcW w:type="dxa" w:w="3744"/>
+            <w:tcW w:type="dxa" w:w="3557"/>
             <w:shd w:fill="9B2C2C" w:color="auto" w:val="clear"/>
             <w:tcMar>
               <w:top w:type="dxa" w:w="90"/>
@@ -788,7 +788,7 @@
                 <w:sz w:val="20"/>
                 <w:szCs w:val="20"/>
               </w:rPr>
-              <w:t xml:space="preserve">Capture on</w:t>
+              <w:t xml:space="preserve">Record on</w:t>
             </w:r>
           </w:p>
         </w:tc>
@@ -828,7 +828,7 @@
         </w:tc>
         <w:tc>
           <w:tcPr>
-            <w:tcW w:type="dxa" w:w="4493"/>
+            <w:tcW w:type="dxa" w:w="4680"/>
             <w:tcMar>
               <w:top w:type="dxa" w:w="90"/>
               <w:left w:type="dxa" w:w="110"/>
@@ -856,7 +856,7 @@
         </w:tc>
         <w:tc>
           <w:tcPr>
-            <w:tcW w:type="dxa" w:w="3744"/>
+            <w:tcW w:type="dxa" w:w="3557"/>
             <w:tcMar>
               <w:top w:type="dxa" w:w="90"/>
               <w:left w:type="dxa" w:w="110"/>
@@ -878,7 +878,7 @@
                 <w:sz w:val="21"/>
                 <w:szCs w:val="21"/>
               </w:rPr>
-              <w:t xml:space="preserve">EMS Essential Standards Organizer</w:t>
+              <w:t xml:space="preserve">Essential Learning Map · Step 1</w:t>
             </w:r>
           </w:p>
         </w:tc>
@@ -918,7 +918,7 @@
         </w:tc>
         <w:tc>
           <w:tcPr>
-            <w:tcW w:type="dxa" w:w="4493"/>
+            <w:tcW w:type="dxa" w:w="4680"/>
             <w:tcMar>
               <w:top w:type="dxa" w:w="90"/>
               <w:left w:type="dxa" w:w="110"/>
@@ -940,13 +940,13 @@
                 <w:sz w:val="21"/>
                 <w:szCs w:val="21"/>
               </w:rPr>
-              <w:t xml:space="preserve">EMS Learning Target Breakdown — Deconstructing an Essential Standard (Solution Tree) is optional</w:t>
-            </w:r>
-          </w:p>
-        </w:tc>
-        <w:tc>
-          <w:tcPr>
-            <w:tcW w:type="dxa" w:w="3744"/>
+              <w:t xml:space="preserve">Deconstructing an Essential Standard (Solution Tree)</w:t>
+            </w:r>
+          </w:p>
+        </w:tc>
+        <w:tc>
+          <w:tcPr>
+            <w:tcW w:type="dxa" w:w="3557"/>
             <w:tcMar>
               <w:top w:type="dxa" w:w="90"/>
               <w:left w:type="dxa" w:w="110"/>
@@ -968,7 +968,7 @@
                 <w:sz w:val="21"/>
                 <w:szCs w:val="21"/>
               </w:rPr>
-              <w:t xml:space="preserve">EMS Learning Target Breakdown</w:t>
+              <w:t xml:space="preserve">Essential Learning Map · Step 2</w:t>
             </w:r>
           </w:p>
         </w:tc>
@@ -1008,7 +1008,7 @@
         </w:tc>
         <w:tc>
           <w:tcPr>
-            <w:tcW w:type="dxa" w:w="4493"/>
+            <w:tcW w:type="dxa" w:w="4680"/>
             <w:tcMar>
               <w:top w:type="dxa" w:w="90"/>
               <w:left w:type="dxa" w:w="110"/>
@@ -1030,13 +1030,13 @@
                 <w:sz w:val="21"/>
                 <w:szCs w:val="21"/>
               </w:rPr>
-              <w:t xml:space="preserve">Gaining Shared Clarity (Solution Tree)</w:t>
-            </w:r>
-          </w:p>
-        </w:tc>
-        <w:tc>
-          <w:tcPr>
-            <w:tcW w:type="dxa" w:w="3744"/>
+              <w:t xml:space="preserve">Gaining Shared Clarity · Developing a Success Checklist (Solution Tree)</w:t>
+            </w:r>
+          </w:p>
+        </w:tc>
+        <w:tc>
+          <w:tcPr>
+            <w:tcW w:type="dxa" w:w="3557"/>
             <w:tcMar>
               <w:top w:type="dxa" w:w="90"/>
               <w:left w:type="dxa" w:w="110"/>
@@ -1058,7 +1058,7 @@
                 <w:sz w:val="21"/>
                 <w:szCs w:val="21"/>
               </w:rPr>
-              <w:t xml:space="preserve">Developing a Success Checklist (Solution Tree)</w:t>
+              <w:t xml:space="preserve">Essential Learning Map · Step 3</w:t>
             </w:r>
           </w:p>
         </w:tc>
@@ -1098,7 +1098,7 @@
         </w:tc>
         <w:tc>
           <w:tcPr>
-            <w:tcW w:type="dxa" w:w="4493"/>
+            <w:tcW w:type="dxa" w:w="4680"/>
             <w:tcMar>
               <w:top w:type="dxa" w:w="90"/>
               <w:left w:type="dxa" w:w="110"/>
@@ -1120,13 +1120,13 @@
                 <w:sz w:val="21"/>
                 <w:szCs w:val="21"/>
               </w:rPr>
-              <w:t xml:space="preserve">Proficiency Anchors protocol (write, compare, refine)</w:t>
-            </w:r>
-          </w:p>
-        </w:tc>
-        <w:tc>
-          <w:tcPr>
-            <w:tcW w:type="dxa" w:w="3744"/>
+              <w:t xml:space="preserve">Proficiency Anchors think sheet (EMS)</w:t>
+            </w:r>
+          </w:p>
+        </w:tc>
+        <w:tc>
+          <w:tcPr>
+            <w:tcW w:type="dxa" w:w="3557"/>
             <w:tcMar>
               <w:top w:type="dxa" w:w="90"/>
               <w:left w:type="dxa" w:w="110"/>
@@ -1148,7 +1148,7 @@
                 <w:sz w:val="21"/>
                 <w:szCs w:val="21"/>
               </w:rPr>
-              <w:t xml:space="preserve">EMS Proficiency Anchors</w:t>
+              <w:t xml:space="preserve">Essential Learning Map · Step 4</w:t>
             </w:r>
           </w:p>
         </w:tc>
@@ -1166,7 +1166,59 @@
           <w:sz w:val="21"/>
           <w:szCs w:val="21"/>
         </w:rPr>
-        <w:t xml:space="preserve">Meeting 8 builds a shared definition of proficiency — but it is not scoring calibration. You can't truly calibrate scores until students have taken the common assessment, so that real calibration comes later, after the first CFA. For now, the team agrees on what proficient looks like.</w:t>
+        <w:t xml:space="preserve">Meeting 8 builds a shared definition of proficiency — but it is not scoring calibration. You can't truly calibrate scores until students have taken the common assessment, so that real calibration comes later, after the first CFA. For now, the team agrees on what proficient looks like and records it on the Map.</w:t>
+      </w:r>
+    </w:p>
+    <w:p>
+      <w:pPr>
+        <w:keepNext/>
+        <w:spacing w:after="80" w:before="200"/>
+      </w:pPr>
+      <w:r>
+        <w:rPr>
+          <w:rFonts w:ascii="Calibri" w:cs="Calibri" w:eastAsia="Calibri" w:hAnsi="Calibri"/>
+          <w:b/>
+          <w:bCs/>
+          <w:color w:val="9B2C2C"/>
+          <w:sz w:val="25"/>
+          <w:szCs w:val="25"/>
+        </w:rPr>
+        <w:t xml:space="preserve">Model examples</w:t>
+      </w:r>
+    </w:p>
+    <w:p>
+      <w:pPr>
+        <w:spacing w:after="120"/>
+      </w:pPr>
+      <w:r>
+        <w:rPr>
+          <w:rFonts w:ascii="Calibri" w:cs="Calibri" w:eastAsia="Calibri" w:hAnsi="Calibri"/>
+          <w:color w:val="1F2933"/>
+          <w:sz w:val="22"/>
+          <w:szCs w:val="22"/>
+        </w:rPr>
+        <w:t xml:space="preserve">Not sure what a finished Map looks like? See a completed example for your subject and grade — </w:t>
+      </w:r>
+      <w:hyperlink w:history="1" r:id="rIday6doeax1bni5lj8_wg-n">
+        <w:r>
+          <w:rPr>
+            <w:rFonts w:ascii="Calibri" w:cs="Calibri" w:eastAsia="Calibri" w:hAnsi="Calibri"/>
+            <w:color w:val="0563C1"/>
+            <w:sz w:val="22"/>
+            <w:szCs w:val="22"/>
+            <w:u w:val="single"/>
+          </w:rPr>
+          <w:t xml:space="preserve">Essential Learning Map: modeled examples by subject &amp; grade</w:t>
+        </w:r>
+      </w:hyperlink>
+      <w:r>
+        <w:rPr>
+          <w:rFonts w:ascii="Calibri" w:cs="Calibri" w:eastAsia="Calibri" w:hAnsi="Calibri"/>
+          <w:color w:val="1F2933"/>
+          <w:sz w:val="22"/>
+          <w:szCs w:val="22"/>
+        </w:rPr>
+        <w:t xml:space="preserve"> — to model the end product you're aiming for by Meeting 8.</w:t>
       </w:r>
     </w:p>
     <w:p>

</xml_diff>